<commit_message>
Add problem sets and tutor
</commit_message>
<xml_diff>
--- a/Fall_2026/CPBP_8306_syllabus_20260820.docx
+++ b/Fall_2026/CPBP_8306_syllabus_20260820.docx
@@ -152,6 +152,12 @@
       </w:r>
     </w:p>
     <w:p>
+      <w:pPr>
+        <w:rPr>
+          <w:sz w:val="24"/>
+          <w:szCs w:val="24"/>
+        </w:rPr>
+      </w:pPr>
       <w:r>
         <w:rPr>
           <w:sz w:val="24"/>
@@ -166,9 +172,35 @@
           <w:sz w:val="24"/>
           <w:szCs w:val="24"/>
         </w:rPr>
+        <w:t xml:space="preserve">ChatGPT Tutor: </w:t>
+      </w:r>
+      <w:hyperlink r:id="rId8" w:history="1">
+        <w:r>
+          <w:rPr>
+            <w:rStyle w:val="Hyperlink"/>
+            <w:sz w:val="24"/>
+            <w:szCs w:val="24"/>
+          </w:rPr>
+          <w:t>https://chatgpt.com/g/g-6ab16756e9f08191a44cbe9da6db427b-data-analysis-cpbp-8306-02-tutor</w:t>
+        </w:r>
+      </w:hyperlink>
+      <w:r>
+        <w:rPr>
+          <w:sz w:val="24"/>
+          <w:szCs w:val="24"/>
+        </w:rPr>
+        <w:t xml:space="preserve"> </w:t>
+      </w:r>
+    </w:p>
+    <w:p>
+      <w:r>
+        <w:rPr>
+          <w:sz w:val="24"/>
+          <w:szCs w:val="24"/>
+        </w:rPr>
         <w:t xml:space="preserve">Course Research Guide: </w:t>
       </w:r>
-      <w:hyperlink r:id="rId8" w:history="1">
+      <w:hyperlink r:id="rId9" w:history="1">
         <w:r>
           <w:rPr>
             <w:rStyle w:val="Hyperlink"/>
@@ -190,7 +222,7 @@
         </w:rPr>
         <w:t xml:space="preserve">GitHub Repository: </w:t>
       </w:r>
-      <w:hyperlink r:id="rId9" w:history="1">
+      <w:hyperlink r:id="rId10" w:history="1">
         <w:r>
           <w:rPr>
             <w:rStyle w:val="Hyperlink"/>
@@ -497,15 +529,8 @@
           <w:sz w:val="24"/>
           <w:szCs w:val="24"/>
         </w:rPr>
-        <w:t xml:space="preserve">Rather than alternating between Python and R by week, this course is organized by concept: each topic is taught once in one language and then translated into the other, so students build a single </w:t>
-      </w:r>
-      <w:r>
-        <w:rPr>
-          <w:sz w:val="24"/>
-          <w:szCs w:val="24"/>
-        </w:rPr>
         <w:lastRenderedPageBreak/>
-        <w:t xml:space="preserve">mental model instead of relearning it twice. Python is the default language for early foundational topics (Sessions 1–6), because its errors are more explicit and its syntax is more approachable for students new to programming. R becomes the default from Session 9 onward, for statistics and publication-quality graphics, where its ecosystem is strongest. The two data-wrangling sessions (7–8) present pandas and the </w:t>
+        <w:t xml:space="preserve">Rather than alternating between Python and R by week, this course is organized by concept: each topic is taught once in one language and then translated into the other, so students build a single mental model instead of relearning it twice. Python is the default language for early foundational topics (Sessions 1–6), because its errors are more explicit and its syntax is more approachable for students new to programming. R becomes the default from Session 9 onward, for statistics and publication-quality graphics, where its ecosystem is strongest. The two data-wrangling sessions (7–8) present pandas and the </w:t>
       </w:r>
       <w:proofErr w:type="spellStart"/>
       <w:r>
@@ -1413,6 +1438,7 @@
                 <w:sz w:val="22"/>
                 <w:szCs w:val="22"/>
               </w:rPr>
+              <w:lastRenderedPageBreak/>
               <w:t>Dictionaries and named lists</w:t>
             </w:r>
           </w:p>
@@ -1459,7 +1485,6 @@
                 <w:sz w:val="22"/>
                 <w:szCs w:val="22"/>
               </w:rPr>
-              <w:lastRenderedPageBreak/>
               <w:t>09/17/2026</w:t>
             </w:r>
           </w:p>
@@ -2704,6 +2729,7 @@
                 <w:sz w:val="22"/>
                 <w:szCs w:val="22"/>
               </w:rPr>
+              <w:lastRenderedPageBreak/>
               <w:t>Reading statistical output in R and Python</w:t>
             </w:r>
           </w:p>
@@ -2750,7 +2776,6 @@
                 <w:sz w:val="22"/>
                 <w:szCs w:val="22"/>
               </w:rPr>
-              <w:lastRenderedPageBreak/>
               <w:t>11/19/2026</w:t>
             </w:r>
           </w:p>
@@ -3424,7 +3449,7 @@
         </w:rPr>
         <w:t xml:space="preserve">Policy Map: </w:t>
       </w:r>
-      <w:hyperlink r:id="rId10" w:history="1">
+      <w:hyperlink r:id="rId11" w:history="1">
         <w:r>
           <w:rPr>
             <w:rStyle w:val="Hyperlink"/>
@@ -3451,7 +3476,7 @@
         </w:rPr>
         <w:t xml:space="preserve">Our World in Data: </w:t>
       </w:r>
-      <w:hyperlink r:id="rId11" w:history="1">
+      <w:hyperlink r:id="rId12" w:history="1">
         <w:r>
           <w:rPr>
             <w:rStyle w:val="Hyperlink"/>
@@ -3478,7 +3503,7 @@
         </w:rPr>
         <w:t xml:space="preserve">Statista: </w:t>
       </w:r>
-      <w:hyperlink r:id="rId12" w:history="1">
+      <w:hyperlink r:id="rId13" w:history="1">
         <w:r>
           <w:rPr>
             <w:rStyle w:val="Hyperlink"/>
@@ -3505,7 +3530,7 @@
         </w:rPr>
         <w:t xml:space="preserve">International Agency for Research on Cancer: </w:t>
       </w:r>
-      <w:hyperlink r:id="rId13" w:history="1">
+      <w:hyperlink r:id="rId14" w:history="1">
         <w:r>
           <w:rPr>
             <w:rStyle w:val="Hyperlink"/>
@@ -3532,7 +3557,7 @@
         </w:rPr>
         <w:t xml:space="preserve">Social Explorer: </w:t>
       </w:r>
-      <w:hyperlink r:id="rId14" w:history="1">
+      <w:hyperlink r:id="rId15" w:history="1">
         <w:r>
           <w:rPr>
             <w:rStyle w:val="Hyperlink"/>
@@ -3560,7 +3585,7 @@
         <w:lastRenderedPageBreak/>
         <w:t xml:space="preserve">Inter-university Consortium for Political and Social Research (ICPSR): </w:t>
       </w:r>
-      <w:hyperlink r:id="rId15" w:history="1">
+      <w:hyperlink r:id="rId16" w:history="1">
         <w:r>
           <w:rPr>
             <w:rStyle w:val="Hyperlink"/>
@@ -3587,7 +3612,7 @@
         </w:rPr>
         <w:t xml:space="preserve">Google dataset search: </w:t>
       </w:r>
-      <w:hyperlink r:id="rId16" w:history="1">
+      <w:hyperlink r:id="rId17" w:history="1">
         <w:r>
           <w:rPr>
             <w:rStyle w:val="Hyperlink"/>
@@ -3614,7 +3639,7 @@
         </w:rPr>
         <w:t xml:space="preserve">Surveillance, Epidemiology, and End Results Program: </w:t>
       </w:r>
-      <w:hyperlink r:id="rId17" w:history="1">
+      <w:hyperlink r:id="rId18" w:history="1">
         <w:r>
           <w:rPr>
             <w:rStyle w:val="Hyperlink"/>
@@ -3641,7 +3666,7 @@
         </w:rPr>
         <w:t xml:space="preserve">NIH-NCI Genomic Data Commons: </w:t>
       </w:r>
-      <w:hyperlink r:id="rId18" w:history="1">
+      <w:hyperlink r:id="rId19" w:history="1">
         <w:r>
           <w:rPr>
             <w:rStyle w:val="Hyperlink"/>
@@ -3668,7 +3693,7 @@
         </w:rPr>
         <w:t xml:space="preserve">WHO Global Health Indicators: </w:t>
       </w:r>
-      <w:hyperlink r:id="rId19" w:history="1">
+      <w:hyperlink r:id="rId20" w:history="1">
         <w:r>
           <w:rPr>
             <w:rStyle w:val="Hyperlink"/>
@@ -3695,7 +3720,7 @@
         </w:rPr>
         <w:t xml:space="preserve">Agency for Toxic Substances and Disease Registry: </w:t>
       </w:r>
-      <w:hyperlink r:id="rId20" w:history="1">
+      <w:hyperlink r:id="rId21" w:history="1">
         <w:r>
           <w:rPr>
             <w:rStyle w:val="Hyperlink"/>
@@ -3722,7 +3747,7 @@
         </w:rPr>
         <w:t xml:space="preserve">SAGE Data: </w:t>
       </w:r>
-      <w:hyperlink r:id="rId21" w:history="1">
+      <w:hyperlink r:id="rId22" w:history="1">
         <w:r>
           <w:rPr>
             <w:rStyle w:val="Hyperlink"/>
@@ -4612,6 +4637,18 @@
       <w:szCs w:val="20"/>
     </w:rPr>
   </w:style>
+  <w:style w:type="character" w:styleId="UnresolvedMention">
+    <w:name w:val="Unresolved Mention"/>
+    <w:basedOn w:val="DefaultParagraphFont"/>
+    <w:uiPriority w:val="99"/>
+    <w:semiHidden/>
+    <w:unhideWhenUsed/>
+    <w:rsid w:val="006C408B"/>
+    <w:rPr>
+      <w:color w:val="605E5C"/>
+      <w:shd w:val="clear" w:color="auto" w:fill="E1DFDD"/>
+    </w:rPr>
+  </w:style>
 </w:styles>
 </file>
 

</xml_diff>